<commit_message>
Refactor phase C: component boundaries, architecture test, Modal focus trap, docs updated to the new layout
Co-Authored-By: Claude Sonnet 5.5 <noreply@anthropic.com>
Claude-Session: https://claude.ai/code/session_01Cf2G3TpPkUnBMvTak1UT1v
</commit_message>
<xml_diff>
--- a/docs/Forge_Component_Spec.docx
+++ b/docs/Forge_Component_Spec.docx
@@ -410,7 +410,7 @@
                 <w:sz w:val="18"/>
                 <w:szCs w:val="18"/>
               </w:rPr>
-              <w:t xml:space="preserve">Each component lists where today's code does not yet match the target design, so the later refactor has a clear checklist.</w:t>
+              <w:t xml:space="preserve">Each component lists where it lives in the code and any remaining notes.</w:t>
             </w:r>
           </w:p>
         </w:tc>
@@ -6561,7 +6561,7 @@
         <w:rPr>
           <w:rFonts w:ascii="Calibri" w:cs="Calibri" w:eastAsia="Calibri" w:hAnsi="Calibri"/>
         </w:rPr>
-        <w:t xml:space="preserve">Where it lives in the code today</w:t>
+        <w:t xml:space="preserve">Where it lives in the code</w:t>
       </w:r>
     </w:p>
     <w:p>
@@ -6577,7 +6577,7 @@
         <w:rPr>
           <w:rFonts w:ascii="Calibri" w:cs="Calibri" w:eastAsia="Calibri" w:hAnsi="Calibri"/>
         </w:rPr>
-        <w:t xml:space="preserve">pages/Login.jsx (sign in/up UI and error mapping)</w:t>
+        <w:t xml:space="preserve">identity/AuthProvider.jsx (session, signOut)</w:t>
       </w:r>
     </w:p>
     <w:p>
@@ -6593,7 +6593,7 @@
         <w:rPr>
           <w:rFonts w:ascii="Calibri" w:cs="Calibri" w:eastAsia="Calibri" w:hAnsi="Calibri"/>
         </w:rPr>
-        <w:t xml:space="preserve">AppContext.jsx (auth state + profile creation; to be split)</w:t>
+        <w:t xml:space="preserve">identity/ProfileProvider.jsx (profile, saveProfile, default profile)</w:t>
       </w:r>
     </w:p>
     <w:p>
@@ -6609,7 +6609,23 @@
         <w:rPr>
           <w:rFonts w:ascii="Calibri" w:cs="Calibri" w:eastAsia="Calibri" w:hAnsi="Calibri"/>
         </w:rPr>
-        <w:t xml:space="preserve">firebase.js (auth, googleProvider)</w:t>
+        <w:t xml:space="preserve">identity/Login.jsx (sign in/up UI and error mapping)</w:t>
+      </w:r>
+    </w:p>
+    <w:p>
+      <w:pPr>
+        <w:pStyle w:val="ListParagraph"/>
+        <w:numPr>
+          <w:ilvl w:val="0"/>
+          <w:numId w:val="2"/>
+        </w:numPr>
+        <w:spacing w:after="60"/>
+      </w:pPr>
+      <w:r>
+        <w:rPr>
+          <w:rFonts w:ascii="Calibri" w:cs="Calibri" w:eastAsia="Calibri" w:hAnsi="Calibri"/>
+        </w:rPr>
+        <w:t xml:space="preserve">firebase.js (SDK initialisation)</w:t>
       </w:r>
     </w:p>
     <w:p>
@@ -6681,7 +6697,7 @@
         <w:rPr>
           <w:rFonts w:ascii="Calibri" w:cs="Calibri" w:eastAsia="Calibri" w:hAnsi="Calibri"/>
         </w:rPr>
-        <w:t xml:space="preserve">Known gaps against the target design</w:t>
+        <w:t xml:space="preserve">Remaining notes</w:t>
       </w:r>
     </w:p>
     <w:p>
@@ -6697,7 +6713,7 @@
         <w:rPr>
           <w:rFonts w:ascii="Calibri" w:cs="Calibri" w:eastAsia="Calibri" w:hAnsi="Calibri"/>
         </w:rPr>
-        <w:t xml:space="preserve">Auth and profile code lives inside AppContext.jsx next to the data helpers and unit helpers; to be split into C1, C2 and C10.</w:t>
+        <w:t xml:space="preserve">None. Session and profile are separate providers; the shell mounts them in order (session, data store, profile, units).</w:t>
       </w:r>
     </w:p>
     <w:p>
@@ -8442,7 +8458,7 @@
         <w:rPr>
           <w:rFonts w:ascii="Calibri" w:cs="Calibri" w:eastAsia="Calibri" w:hAnsi="Calibri"/>
         </w:rPr>
-        <w:t xml:space="preserve">Where it lives in the code today</w:t>
+        <w:t xml:space="preserve">Where it lives in the code</w:t>
       </w:r>
     </w:p>
     <w:p>
@@ -8458,7 +8474,7 @@
         <w:rPr>
           <w:rFonts w:ascii="Calibri" w:cs="Calibri" w:eastAsia="Calibri" w:hAnsi="Calibri"/>
         </w:rPr>
-        <w:t xml:space="preserve">AppContext.jsx (add/put/merge/ensureDoc/upd/del and useCol; to be extracted)</w:t>
+        <w:t xml:space="preserve">datastore/DataStore.jsx (makeDataStore, DataStoreProvider, useDataStore, useCol)</w:t>
       </w:r>
     </w:p>
     <w:p>
@@ -8530,7 +8546,7 @@
         <w:rPr>
           <w:rFonts w:ascii="Calibri" w:cs="Calibri" w:eastAsia="Calibri" w:hAnsi="Calibri"/>
         </w:rPr>
-        <w:t xml:space="preserve">Known gaps against the target design</w:t>
+        <w:t xml:space="preserve">Remaining notes</w:t>
       </w:r>
     </w:p>
     <w:p>
@@ -8546,7 +8562,7 @@
         <w:rPr>
           <w:rFonts w:ascii="Calibri" w:cs="Calibri" w:eastAsia="Calibri" w:hAnsi="Calibri"/>
         </w:rPr>
-        <w:t xml:space="preserve">Today useCol, add, put... live in AppContext.jsx together with auth, profile and units.</w:t>
+        <w:t xml:space="preserve">None. The uid is injected by the shell, so there is no dependency on Identity.</w:t>
       </w:r>
     </w:p>
     <w:p>
@@ -10970,7 +10986,7 @@
         <w:rPr>
           <w:rFonts w:ascii="Calibri" w:cs="Calibri" w:eastAsia="Calibri" w:hAnsi="Calibri"/>
         </w:rPr>
-        <w:t xml:space="preserve">Where it lives in the code today</w:t>
+        <w:t xml:space="preserve">Where it lives in the code</w:t>
       </w:r>
     </w:p>
     <w:p>
@@ -10986,7 +11002,7 @@
         <w:rPr>
           <w:rFonts w:ascii="Calibri" w:cs="Calibri" w:eastAsia="Calibri" w:hAnsi="Calibri"/>
         </w:rPr>
-        <w:t xml:space="preserve">data/exercises.json, data/muscleFolders.js, data/popular.js, data/videos.json</w:t>
+        <w:t xml:space="preserve">library/data/ (exercises.json, muscleFolders.js, popular.js, videos.json)</w:t>
       </w:r>
     </w:p>
     <w:p>
@@ -11002,7 +11018,7 @@
         <w:rPr>
           <w:rFonts w:ascii="Calibri" w:cs="Calibri" w:eastAsia="Calibri" w:hAnsi="Calibri"/>
         </w:rPr>
-        <w:t xml:space="preserve">lib/exerciseData.js, exerciseSearch.js, exerciseSummary.js, exerciseViews.js (libView/customView/docView)</w:t>
+        <w:t xml:space="preserve">library/exerciseData.js, exerciseSearch.js, exerciseSummary.js, exerciseViews.js, useExerciseDocs.js</w:t>
       </w:r>
     </w:p>
     <w:p>
@@ -11018,7 +11034,19 @@
         <w:rPr>
           <w:rFonts w:ascii="Calibri" w:cs="Calibri" w:eastAsia="Calibri" w:hAnsi="Calibri"/>
         </w:rPr>
-        <w:t xml:space="preserve">pages/Exercises.jsx</w:t>
+        <w:t xml:space="preserve">library/components/ (ExerciseImage, ExerciseMedia, MuscleChips, HowTo, FavoriteButton, MyCustom)</w:t>
+      </w:r>
+    </w:p>
+    <w:p>
+      <w:pPr>
+        <w:pStyle w:val="Heading3"/>
+        <w:keepNext/>
+      </w:pPr>
+      <w:r>
+        <w:rPr>
+          <w:rFonts w:ascii="Calibri" w:cs="Calibri" w:eastAsia="Calibri" w:hAnsi="Calibri"/>
+        </w:rPr>
+        <w:t xml:space="preserve">Rules and behaviour</w:t>
       </w:r>
     </w:p>
     <w:p>
@@ -11034,19 +11062,7 @@
         <w:rPr>
           <w:rFonts w:ascii="Calibri" w:cs="Calibri" w:eastAsia="Calibri" w:hAnsi="Calibri"/>
         </w:rPr>
-        <w:t xml:space="preserve">components/exercise/ExerciseImage, ExerciseMedia, MuscleChips, HowTo, FavoriteButton, MyCustom</w:t>
-      </w:r>
-    </w:p>
-    <w:p>
-      <w:pPr>
-        <w:pStyle w:val="Heading3"/>
-        <w:keepNext/>
-      </w:pPr>
-      <w:r>
-        <w:rPr>
-          <w:rFonts w:ascii="Calibri" w:cs="Calibri" w:eastAsia="Calibri" w:hAnsi="Calibri"/>
-        </w:rPr>
-        <w:t xml:space="preserve">Rules and behaviour</w:t>
+        <w:t xml:space="preserve">Library exercises have no personal document until first favorite, log or add-to-plan.</w:t>
       </w:r>
     </w:p>
     <w:p>
@@ -11062,7 +11078,7 @@
         <w:rPr>
           <w:rFonts w:ascii="Calibri" w:cs="Calibri" w:eastAsia="Calibri" w:hAnsi="Calibri"/>
         </w:rPr>
-        <w:t xml:space="preserve">Library exercises have no personal document until first favorite, log or add-to-plan.</w:t>
+        <w:t xml:space="preserve">Deleting a folder never deletes exercises or logs.</w:t>
       </w:r>
     </w:p>
     <w:p>
@@ -11078,7 +11094,19 @@
         <w:rPr>
           <w:rFonts w:ascii="Calibri" w:cs="Calibri" w:eastAsia="Calibri" w:hAnsi="Calibri"/>
         </w:rPr>
-        <w:t xml:space="preserve">Deleting a folder never deletes exercises or logs.</w:t>
+        <w:t xml:space="preserve">videos.json stays empty; the only video feature is the search link.</w:t>
+      </w:r>
+    </w:p>
+    <w:p>
+      <w:pPr>
+        <w:pStyle w:val="Heading3"/>
+        <w:keepNext/>
+      </w:pPr>
+      <w:r>
+        <w:rPr>
+          <w:rFonts w:ascii="Calibri" w:cs="Calibri" w:eastAsia="Calibri" w:hAnsi="Calibri"/>
+        </w:rPr>
+        <w:t xml:space="preserve">Remaining notes</w:t>
       </w:r>
     </w:p>
     <w:p>
@@ -11094,51 +11122,7 @@
         <w:rPr>
           <w:rFonts w:ascii="Calibri" w:cs="Calibri" w:eastAsia="Calibri" w:hAnsi="Calibri"/>
         </w:rPr>
-        <w:t xml:space="preserve">videos.json stays empty; the only video feature is the search link.</w:t>
-      </w:r>
-    </w:p>
-    <w:p>
-      <w:pPr>
-        <w:pStyle w:val="Heading3"/>
-        <w:keepNext/>
-      </w:pPr>
-      <w:r>
-        <w:rPr>
-          <w:rFonts w:ascii="Calibri" w:cs="Calibri" w:eastAsia="Calibri" w:hAnsi="Calibri"/>
-        </w:rPr>
-        <w:t xml:space="preserve">Known gaps against the target design</w:t>
-      </w:r>
-    </w:p>
-    <w:p>
-      <w:pPr>
-        <w:pStyle w:val="ListParagraph"/>
-        <w:numPr>
-          <w:ilvl w:val="0"/>
-          <w:numId w:val="2"/>
-        </w:numPr>
-        <w:spacing w:after="60"/>
-      </w:pPr>
-      <w:r>
-        <w:rPr>
-          <w:rFonts w:ascii="Calibri" w:cs="Calibri" w:eastAsia="Calibri" w:hAnsi="Calibri"/>
-        </w:rPr>
-        <w:t xml:space="preserve">Exercises.jsx also reads logs to show "last weight" and recent exercises, and ExerciseDetail deletes an exercise together with its logs. In the target design these two cross-component actions belong to C12 (Lifts view and Exercise detail view), so C3 does not depend on C4.</w:t>
-      </w:r>
-    </w:p>
-    <w:p>
-      <w:pPr>
-        <w:pStyle w:val="ListParagraph"/>
-        <w:numPr>
-          <w:ilvl w:val="0"/>
-          <w:numId w:val="2"/>
-        </w:numPr>
-        <w:spacing w:after="60"/>
-      </w:pPr>
-      <w:r>
-        <w:rPr>
-          <w:rFonts w:ascii="Calibri" w:cs="Calibri" w:eastAsia="Calibri" w:hAnsi="Calibri"/>
-        </w:rPr>
-        <w:t xml:space="preserve">exerciseViews.js also holds recentExerciseIds and groupLogs, which belong to C4.</w:t>
+        <w:t xml:space="preserve">The Lifts page (app/views/Lifts.jsx) is a composition view: it reads logs for the last weight and passes them into MyCustom, so the library never reads logs.</w:t>
       </w:r>
     </w:p>
     <w:p>
@@ -13422,7 +13406,7 @@
         <w:rPr>
           <w:rFonts w:ascii="Calibri" w:cs="Calibri" w:eastAsia="Calibri" w:hAnsi="Calibri"/>
         </w:rPr>
-        <w:t xml:space="preserve">Where it lives in the code today</w:t>
+        <w:t xml:space="preserve">Where it lives in the code</w:t>
       </w:r>
     </w:p>
     <w:p>
@@ -13438,7 +13422,7 @@
         <w:rPr>
           <w:rFonts w:ascii="Calibri" w:cs="Calibri" w:eastAsia="Calibri" w:hAnsi="Calibri"/>
         </w:rPr>
-        <w:t xml:space="preserve">components/exercise/LogTab.jsx</w:t>
+        <w:t xml:space="preserve">logging/LogTab.jsx</w:t>
       </w:r>
     </w:p>
     <w:p>
@@ -13454,7 +13438,7 @@
         <w:rPr>
           <w:rFonts w:ascii="Calibri" w:cs="Calibri" w:eastAsia="Calibri" w:hAnsi="Calibri"/>
         </w:rPr>
-        <w:t xml:space="preserve">lib/setDrafts.js</w:t>
+        <w:t xml:space="preserve">logging/setDrafts.js</w:t>
       </w:r>
     </w:p>
     <w:p>
@@ -13470,7 +13454,7 @@
         <w:rPr>
           <w:rFonts w:ascii="Calibri" w:cs="Calibri" w:eastAsia="Calibri" w:hAnsi="Calibri"/>
         </w:rPr>
-        <w:t xml:space="preserve">logging form and history in pages/ExerciseDetail.jsx</w:t>
+        <w:t xml:space="preserve">logging/logReader.js (groupLogs, recentExerciseIds, setsOn)</w:t>
       </w:r>
     </w:p>
     <w:p>
@@ -13486,7 +13470,7 @@
         <w:rPr>
           <w:rFonts w:ascii="Calibri" w:cs="Calibri" w:eastAsia="Calibri" w:hAnsi="Calibri"/>
         </w:rPr>
-        <w:t xml:space="preserve">groupLogs and recentExerciseIds currently in lib/exerciseViews.js</w:t>
+        <w:t xml:space="preserve">logging/useLogs.js</w:t>
       </w:r>
     </w:p>
     <w:p>
@@ -13558,7 +13542,7 @@
         <w:rPr>
           <w:rFonts w:ascii="Calibri" w:cs="Calibri" w:eastAsia="Calibri" w:hAnsi="Calibri"/>
         </w:rPr>
-        <w:t xml:space="preserve">Known gaps against the target design</w:t>
+        <w:t xml:space="preserve">Remaining notes</w:t>
       </w:r>
     </w:p>
     <w:p>
@@ -13574,7 +13558,7 @@
         <w:rPr>
           <w:rFonts w:ascii="Calibri" w:cs="Calibri" w:eastAsia="Calibri" w:hAnsi="Calibri"/>
         </w:rPr>
-        <w:t xml:space="preserve">LogTab also contains the "Add to today's plan" button which edits the plan directly; in the target design it calls C6 (IPlan.addExerciseToDay).</w:t>
+        <w:t xml:space="preserve">The detailed logging form and history on the exercise page live in app/views/ExerciseDetail.jsx (composition view). The Add to todays plan button is passed into LogTab as a slot by the shell.</w:t>
       </w:r>
     </w:p>
     <w:p>
@@ -15351,7 +15335,7 @@
         <w:rPr>
           <w:rFonts w:ascii="Calibri" w:cs="Calibri" w:eastAsia="Calibri" w:hAnsi="Calibri"/>
         </w:rPr>
-        <w:t xml:space="preserve">Where it lives in the code today</w:t>
+        <w:t xml:space="preserve">Where it lives in the code</w:t>
       </w:r>
     </w:p>
     <w:p>
@@ -15367,7 +15351,7 @@
         <w:rPr>
           <w:rFonts w:ascii="Calibri" w:cs="Calibri" w:eastAsia="Calibri" w:hAnsi="Calibri"/>
         </w:rPr>
-        <w:t xml:space="preserve">lib/exerciseStats.js</w:t>
+        <w:t xml:space="preserve">progress/exerciseStats.js</w:t>
       </w:r>
     </w:p>
     <w:p>
@@ -15383,7 +15367,7 @@
         <w:rPr>
           <w:rFonts w:ascii="Calibri" w:cs="Calibri" w:eastAsia="Calibri" w:hAnsi="Calibri"/>
         </w:rPr>
-        <w:t xml:space="preserve">computePRs and epley in utils.js</w:t>
+        <w:t xml:space="preserve">progress/prs.js (computePRs, epley)</w:t>
       </w:r>
     </w:p>
     <w:p>
@@ -15399,7 +15383,7 @@
         <w:rPr>
           <w:rFonts w:ascii="Calibri" w:cs="Calibri" w:eastAsia="Calibri" w:hAnsi="Calibri"/>
         </w:rPr>
-        <w:t xml:space="preserve">components/exercise/ProgressPanel.jsx, Glance.jsx</w:t>
+        <w:t xml:space="preserve">progress/ProgressPanel.jsx, Glance.jsx</w:t>
       </w:r>
     </w:p>
     <w:p>
@@ -15455,7 +15439,7 @@
         <w:rPr>
           <w:rFonts w:ascii="Calibri" w:cs="Calibri" w:eastAsia="Calibri" w:hAnsi="Calibri"/>
         </w:rPr>
-        <w:t xml:space="preserve">Known gaps against the target design</w:t>
+        <w:t xml:space="preserve">Remaining notes</w:t>
       </w:r>
     </w:p>
     <w:p>
@@ -15471,7 +15455,7 @@
         <w:rPr>
           <w:rFonts w:ascii="Calibri" w:cs="Calibri" w:eastAsia="Calibri" w:hAnsi="Calibri"/>
         </w:rPr>
-        <w:t xml:space="preserve">computePRs and epley are still in utils.js; the Charts page builds its own series in the page.</w:t>
+        <w:t xml:space="preserve">Chart series for the Charts page are still built inside app/views/Charts.jsx.</w:t>
       </w:r>
     </w:p>
     <w:p>
@@ -17924,7 +17908,7 @@
         <w:rPr>
           <w:rFonts w:ascii="Calibri" w:cs="Calibri" w:eastAsia="Calibri" w:hAnsi="Calibri"/>
         </w:rPr>
-        <w:t xml:space="preserve">Where it lives in the code today</w:t>
+        <w:t xml:space="preserve">Where it lives in the code</w:t>
       </w:r>
     </w:p>
     <w:p>
@@ -17940,7 +17924,7 @@
         <w:rPr>
           <w:rFonts w:ascii="Calibri" w:cs="Calibri" w:eastAsia="Calibri" w:hAnsi="Calibri"/>
         </w:rPr>
-        <w:t xml:space="preserve">lib/plan.js, usePlan.js, usePlanActions.js</w:t>
+        <w:t xml:space="preserve">plan/plan.js (pure operations), planTemplates.js</w:t>
       </w:r>
     </w:p>
     <w:p>
@@ -17956,7 +17940,7 @@
         <w:rPr>
           <w:rFonts w:ascii="Calibri" w:cs="Calibri" w:eastAsia="Calibri" w:hAnsi="Calibri"/>
         </w:rPr>
-        <w:t xml:space="preserve">data/planTemplates.js</w:t>
+        <w:t xml:space="preserve">plan/usePlan.js, usePlanActions.js</w:t>
       </w:r>
     </w:p>
     <w:p>
@@ -17972,7 +17956,19 @@
         <w:rPr>
           <w:rFonts w:ascii="Calibri" w:cs="Calibri" w:eastAsia="Calibri" w:hAnsi="Calibri"/>
         </w:rPr>
-        <w:t xml:space="preserve">components/plan/*</w:t>
+        <w:t xml:space="preserve">plan/components/ (DayCard, PlanPicker, TemplatesModal, DayPickerSheet, ShiftWeekSheet, AddToPlanButton, AddToTodayButton)</w:t>
+      </w:r>
+    </w:p>
+    <w:p>
+      <w:pPr>
+        <w:pStyle w:val="Heading3"/>
+        <w:keepNext/>
+      </w:pPr>
+      <w:r>
+        <w:rPr>
+          <w:rFonts w:ascii="Calibri" w:cs="Calibri" w:eastAsia="Calibri" w:hAnsi="Calibri"/>
+        </w:rPr>
+        <w:t xml:space="preserve">Rules and behaviour</w:t>
       </w:r>
     </w:p>
     <w:p>
@@ -17988,19 +17984,7 @@
         <w:rPr>
           <w:rFonts w:ascii="Calibri" w:cs="Calibri" w:eastAsia="Calibri" w:hAnsi="Calibri"/>
         </w:rPr>
-        <w:t xml:space="preserve">pages/Plan.jsx</w:t>
-      </w:r>
-    </w:p>
-    <w:p>
-      <w:pPr>
-        <w:pStyle w:val="Heading3"/>
-        <w:keepNext/>
-      </w:pPr>
-      <w:r>
-        <w:rPr>
-          <w:rFonts w:ascii="Calibri" w:cs="Calibri" w:eastAsia="Calibri" w:hAnsi="Calibri"/>
-        </w:rPr>
-        <w:t xml:space="preserve">Rules and behaviour</w:t>
+        <w:t xml:space="preserve">Weekly goal = non-rest days with exercises.</w:t>
       </w:r>
     </w:p>
     <w:p>
@@ -18016,7 +18000,7 @@
         <w:rPr>
           <w:rFonts w:ascii="Calibri" w:cs="Calibri" w:eastAsia="Calibri" w:hAnsi="Calibri"/>
         </w:rPr>
-        <w:t xml:space="preserve">Weekly goal = non-rest days with exercises.</w:t>
+        <w:t xml:space="preserve">The same exercise cannot be added twice to one day.</w:t>
       </w:r>
     </w:p>
     <w:p>
@@ -18032,7 +18016,7 @@
         <w:rPr>
           <w:rFonts w:ascii="Calibri" w:cs="Calibri" w:eastAsia="Calibri" w:hAnsi="Calibri"/>
         </w:rPr>
-        <w:t xml:space="preserve">The same exercise cannot be added twice to one day.</w:t>
+        <w:t xml:space="preserve">Rest days keep their exercises.</w:t>
       </w:r>
     </w:p>
     <w:p>
@@ -18048,7 +18032,7 @@
         <w:rPr>
           <w:rFonts w:ascii="Calibri" w:cs="Calibri" w:eastAsia="Calibri" w:hAnsi="Calibri"/>
         </w:rPr>
-        <w:t xml:space="preserve">Rest days keep their exercises.</w:t>
+        <w:t xml:space="preserve">Targets: sets 1-20, reps 1-100 (defaults 3 x 10).</w:t>
       </w:r>
     </w:p>
     <w:p>
@@ -18064,7 +18048,19 @@
         <w:rPr>
           <w:rFonts w:ascii="Calibri" w:cs="Calibri" w:eastAsia="Calibri" w:hAnsi="Calibri"/>
         </w:rPr>
-        <w:t xml:space="preserve">Targets: sets 1-20, reps 1-100 (defaults 3 x 10).</w:t>
+        <w:t xml:space="preserve">Every shift/move/swap/copy/clear and exercise removal offers Undo for 8 seconds.</w:t>
+      </w:r>
+    </w:p>
+    <w:p>
+      <w:pPr>
+        <w:pStyle w:val="Heading3"/>
+        <w:keepNext/>
+      </w:pPr>
+      <w:r>
+        <w:rPr>
+          <w:rFonts w:ascii="Calibri" w:cs="Calibri" w:eastAsia="Calibri" w:hAnsi="Calibri"/>
+        </w:rPr>
+        <w:t xml:space="preserve">Remaining notes</w:t>
       </w:r>
     </w:p>
     <w:p>
@@ -18080,51 +18076,7 @@
         <w:rPr>
           <w:rFonts w:ascii="Calibri" w:cs="Calibri" w:eastAsia="Calibri" w:hAnsi="Calibri"/>
         </w:rPr>
-        <w:t xml:space="preserve">Every shift/move/swap/copy/clear and exercise removal offers Undo for 8 seconds.</w:t>
-      </w:r>
-    </w:p>
-    <w:p>
-      <w:pPr>
-        <w:pStyle w:val="Heading3"/>
-        <w:keepNext/>
-      </w:pPr>
-      <w:r>
-        <w:rPr>
-          <w:rFonts w:ascii="Calibri" w:cs="Calibri" w:eastAsia="Calibri" w:hAnsi="Calibri"/>
-        </w:rPr>
-        <w:t xml:space="preserve">Known gaps against the target design</w:t>
-      </w:r>
-    </w:p>
-    <w:p>
-      <w:pPr>
-        <w:pStyle w:val="ListParagraph"/>
-        <w:numPr>
-          <w:ilvl w:val="0"/>
-          <w:numId w:val="2"/>
-        </w:numPr>
-        <w:spacing w:after="60"/>
-      </w:pPr>
-      <w:r>
-        <w:rPr>
-          <w:rFonts w:ascii="Calibri" w:cs="Calibri" w:eastAsia="Calibri" w:hAnsi="Calibri"/>
-        </w:rPr>
-        <w:t xml:space="preserve">LogTab edits the plan directly for "Add to today's plan"; TodayCard (C12 composition) lives in components/plan.</w:t>
-      </w:r>
-    </w:p>
-    <w:p>
-      <w:pPr>
-        <w:pStyle w:val="ListParagraph"/>
-        <w:numPr>
-          <w:ilvl w:val="0"/>
-          <w:numId w:val="2"/>
-        </w:numPr>
-        <w:spacing w:after="60"/>
-      </w:pPr>
-      <w:r>
-        <w:rPr>
-          <w:rFonts w:ascii="Calibri" w:cs="Calibri" w:eastAsia="Calibri" w:hAnsi="Calibri"/>
-        </w:rPr>
-        <w:t xml:space="preserve">Plan.jsx holds the undo orchestration; it can move into usePlanActions.</w:t>
+        <w:t xml:space="preserve">The Plan page (app/views/PlanPage.jsx) is a composition view; it also holds the undo orchestration, which could move into usePlanActions.</w:t>
       </w:r>
     </w:p>
     <w:p>
@@ -20083,7 +20035,7 @@
         <w:rPr>
           <w:rFonts w:ascii="Calibri" w:cs="Calibri" w:eastAsia="Calibri" w:hAnsi="Calibri"/>
         </w:rPr>
-        <w:t xml:space="preserve">Where it lives in the code today</w:t>
+        <w:t xml:space="preserve">Where it lives in the code</w:t>
       </w:r>
     </w:p>
     <w:p>
@@ -20099,7 +20051,7 @@
         <w:rPr>
           <w:rFonts w:ascii="Calibri" w:cs="Calibri" w:eastAsia="Calibri" w:hAnsi="Calibri"/>
         </w:rPr>
-        <w:t xml:space="preserve">weekStreak and WEEK_GOAL in utils.js</w:t>
+        <w:t xml:space="preserve">attendance/attendance.js (WEEK_GOAL, weekStreak, weeklyGoal, attendanceSummary)</w:t>
       </w:r>
     </w:p>
     <w:p>
@@ -20115,7 +20067,19 @@
         <w:rPr>
           <w:rFonts w:ascii="Calibri" w:cs="Calibri" w:eastAsia="Calibri" w:hAnsi="Calibri"/>
         </w:rPr>
-        <w:t xml:space="preserve">check-in logic and week row inside pages/Dashboard.jsx</w:t>
+        <w:t xml:space="preserve">attendance/useAttendance.js</w:t>
+      </w:r>
+    </w:p>
+    <w:p>
+      <w:pPr>
+        <w:pStyle w:val="Heading3"/>
+        <w:keepNext/>
+      </w:pPr>
+      <w:r>
+        <w:rPr>
+          <w:rFonts w:ascii="Calibri" w:cs="Calibri" w:eastAsia="Calibri" w:hAnsi="Calibri"/>
+        </w:rPr>
+        <w:t xml:space="preserve">Rules and behaviour</w:t>
       </w:r>
     </w:p>
     <w:p>
@@ -20131,19 +20095,7 @@
         <w:rPr>
           <w:rFonts w:ascii="Calibri" w:cs="Calibri" w:eastAsia="Calibri" w:hAnsi="Calibri"/>
         </w:rPr>
-        <w:t xml:space="preserve">goal field UI in pages/Settings.jsx</w:t>
-      </w:r>
-    </w:p>
-    <w:p>
-      <w:pPr>
-        <w:pStyle w:val="Heading3"/>
-        <w:keepNext/>
-      </w:pPr>
-      <w:r>
-        <w:rPr>
-          <w:rFonts w:ascii="Calibri" w:cs="Calibri" w:eastAsia="Calibri" w:hAnsi="Calibri"/>
-        </w:rPr>
-        <w:t xml:space="preserve">Rules and behaviour</w:t>
+        <w:t xml:space="preserve">Weeks start on Saturday.</w:t>
       </w:r>
     </w:p>
     <w:p>
@@ -20159,7 +20111,19 @@
         <w:rPr>
           <w:rFonts w:ascii="Calibri" w:cs="Calibri" w:eastAsia="Calibri" w:hAnsi="Calibri"/>
         </w:rPr>
-        <w:t xml:space="preserve">Weeks start on Saturday.</w:t>
+        <w:t xml:space="preserve">A day with logged sets cannot be un-checked (it stays done).</w:t>
+      </w:r>
+    </w:p>
+    <w:p>
+      <w:pPr>
+        <w:pStyle w:val="Heading3"/>
+        <w:keepNext/>
+      </w:pPr>
+      <w:r>
+        <w:rPr>
+          <w:rFonts w:ascii="Calibri" w:cs="Calibri" w:eastAsia="Calibri" w:hAnsi="Calibri"/>
+        </w:rPr>
+        <w:t xml:space="preserve">Remaining notes</w:t>
       </w:r>
     </w:p>
     <w:p>
@@ -20175,35 +20139,7 @@
         <w:rPr>
           <w:rFonts w:ascii="Calibri" w:cs="Calibri" w:eastAsia="Calibri" w:hAnsi="Calibri"/>
         </w:rPr>
-        <w:t xml:space="preserve">A day with logged sets cannot be un-checked (it stays done).</w:t>
-      </w:r>
-    </w:p>
-    <w:p>
-      <w:pPr>
-        <w:pStyle w:val="Heading3"/>
-        <w:keepNext/>
-      </w:pPr>
-      <w:r>
-        <w:rPr>
-          <w:rFonts w:ascii="Calibri" w:cs="Calibri" w:eastAsia="Calibri" w:hAnsi="Calibri"/>
-        </w:rPr>
-        <w:t xml:space="preserve">Known gaps against the target design</w:t>
-      </w:r>
-    </w:p>
-    <w:p>
-      <w:pPr>
-        <w:pStyle w:val="ListParagraph"/>
-        <w:numPr>
-          <w:ilvl w:val="0"/>
-          <w:numId w:val="2"/>
-        </w:numPr>
-        <w:spacing w:after="60"/>
-      </w:pPr>
-      <w:r>
-        <w:rPr>
-          <w:rFonts w:ascii="Calibri" w:cs="Calibri" w:eastAsia="Calibri" w:hAnsi="Calibri"/>
-        </w:rPr>
-        <w:t xml:space="preserve">The attendance logic is spread across utils.js and Dashboard.jsx.</w:t>
+        <w:t xml:space="preserve">The weekly goal buttons live in the Settings view (C12), which calls IProfile.</w:t>
       </w:r>
     </w:p>
     <w:p>
@@ -22013,7 +21949,7 @@
         <w:rPr>
           <w:rFonts w:ascii="Calibri" w:cs="Calibri" w:eastAsia="Calibri" w:hAnsi="Calibri"/>
         </w:rPr>
-        <w:t xml:space="preserve">Where it lives in the code today</w:t>
+        <w:t xml:space="preserve">Where it lives in the code</w:t>
       </w:r>
     </w:p>
     <w:p>
@@ -22029,7 +21965,7 @@
         <w:rPr>
           <w:rFonts w:ascii="Calibri" w:cs="Calibri" w:eastAsia="Calibri" w:hAnsi="Calibri"/>
         </w:rPr>
-        <w:t xml:space="preserve">pages/Body.jsx</w:t>
+        <w:t xml:space="preserve">body/BodyPage.jsx</w:t>
       </w:r>
     </w:p>
     <w:p>
@@ -22045,7 +21981,7 @@
         <w:rPr>
           <w:rFonts w:ascii="Calibri" w:cs="Calibri" w:eastAsia="Calibri" w:hAnsi="Calibri"/>
         </w:rPr>
-        <w:t xml:space="preserve">progressPct in utils.js</w:t>
+        <w:t xml:space="preserve">body/bodyMath.js (progressPct)</w:t>
       </w:r>
     </w:p>
     <w:p>
@@ -22061,7 +21997,7 @@
         <w:rPr>
           <w:rFonts w:ascii="Calibri" w:cs="Calibri" w:eastAsia="Calibri" w:hAnsi="Calibri"/>
         </w:rPr>
-        <w:t xml:space="preserve">components/PlateBar.jsx (UI Kit)</w:t>
+        <w:t xml:space="preserve">body/useWeights.js</w:t>
       </w:r>
     </w:p>
     <w:p>
@@ -22117,7 +22053,7 @@
         <w:rPr>
           <w:rFonts w:ascii="Calibri" w:cs="Calibri" w:eastAsia="Calibri" w:hAnsi="Calibri"/>
         </w:rPr>
-        <w:t xml:space="preserve">Known gaps against the target design</w:t>
+        <w:t xml:space="preserve">Remaining notes</w:t>
       </w:r>
     </w:p>
     <w:p>
@@ -22133,7 +22069,7 @@
         <w:rPr>
           <w:rFonts w:ascii="Calibri" w:cs="Calibri" w:eastAsia="Calibri" w:hAnsi="Calibri"/>
         </w:rPr>
-        <w:t xml:space="preserve">progressPct lives in utils.js.</w:t>
+        <w:t xml:space="preserve">None.</w:t>
       </w:r>
     </w:p>
     <w:p>
@@ -23910,7 +23846,7 @@
         <w:rPr>
           <w:rFonts w:ascii="Calibri" w:cs="Calibri" w:eastAsia="Calibri" w:hAnsi="Calibri"/>
         </w:rPr>
-        <w:t xml:space="preserve">Where it lives in the code today</w:t>
+        <w:t xml:space="preserve">Where it lives in the code</w:t>
       </w:r>
     </w:p>
     <w:p>
@@ -23926,7 +23862,7 @@
         <w:rPr>
           <w:rFonts w:ascii="Calibri" w:cs="Calibri" w:eastAsia="Calibri" w:hAnsi="Calibri"/>
         </w:rPr>
-        <w:t xml:space="preserve">pages/InBody.jsx</w:t>
+        <w:t xml:space="preserve">inbody/InBodyPage.jsx</w:t>
       </w:r>
     </w:p>
     <w:p>
@@ -23942,7 +23878,23 @@
         <w:rPr>
           <w:rFonts w:ascii="Calibri" w:cs="Calibri" w:eastAsia="Calibri" w:hAnsi="Calibri"/>
         </w:rPr>
-        <w:t xml:space="preserve">compressImage and IN_METRICS in utils.js</w:t>
+        <w:t xml:space="preserve">inbody/inbody.js (IN_METRICS, compressImage)</w:t>
+      </w:r>
+    </w:p>
+    <w:p>
+      <w:pPr>
+        <w:pStyle w:val="ListParagraph"/>
+        <w:numPr>
+          <w:ilvl w:val="0"/>
+          <w:numId w:val="2"/>
+        </w:numPr>
+        <w:spacing w:after="60"/>
+      </w:pPr>
+      <w:r>
+        <w:rPr>
+          <w:rFonts w:ascii="Calibri" w:cs="Calibri" w:eastAsia="Calibri" w:hAnsi="Calibri"/>
+        </w:rPr>
+        <w:t xml:space="preserve">inbody/useReports.js</w:t>
       </w:r>
     </w:p>
     <w:p>
@@ -23998,7 +23950,7 @@
         <w:rPr>
           <w:rFonts w:ascii="Calibri" w:cs="Calibri" w:eastAsia="Calibri" w:hAnsi="Calibri"/>
         </w:rPr>
-        <w:t xml:space="preserve">Known gaps against the target design</w:t>
+        <w:t xml:space="preserve">Remaining notes</w:t>
       </w:r>
     </w:p>
     <w:p>
@@ -24014,7 +23966,7 @@
         <w:rPr>
           <w:rFonts w:ascii="Calibri" w:cs="Calibri" w:eastAsia="Calibri" w:hAnsi="Calibri"/>
         </w:rPr>
-        <w:t xml:space="preserve">compressImage and IN_METRICS live in utils.js.</w:t>
+        <w:t xml:space="preserve">None.</w:t>
       </w:r>
     </w:p>
     <w:p>
@@ -25710,7 +25662,7 @@
         <w:rPr>
           <w:rFonts w:ascii="Calibri" w:cs="Calibri" w:eastAsia="Calibri" w:hAnsi="Calibri"/>
         </w:rPr>
-        <w:t xml:space="preserve">Where it lives in the code today</w:t>
+        <w:t xml:space="preserve">Where it lives in the code</w:t>
       </w:r>
     </w:p>
     <w:p>
@@ -25726,7 +25678,7 @@
         <w:rPr>
           <w:rFonts w:ascii="Calibri" w:cs="Calibri" w:eastAsia="Calibri" w:hAnsi="Calibri"/>
         </w:rPr>
-        <w:t xml:space="preserve">utils.js (shared part)</w:t>
+        <w:t xml:space="preserve">shared/units.js (makeUnits, KG_PER_LB, r1), shared/UnitsProvider.jsx (useUnits)</w:t>
       </w:r>
     </w:p>
     <w:p>
@@ -25742,7 +25694,7 @@
         <w:rPr>
           <w:rFonts w:ascii="Calibri" w:cs="Calibri" w:eastAsia="Calibri" w:hAnsi="Calibri"/>
         </w:rPr>
-        <w:t xml:space="preserve">show and toKg currently created inside AppContext.jsx</w:t>
+        <w:t xml:space="preserve">shared/dates.js</w:t>
       </w:r>
     </w:p>
     <w:p>
@@ -25782,7 +25734,7 @@
         <w:rPr>
           <w:rFonts w:ascii="Calibri" w:cs="Calibri" w:eastAsia="Calibri" w:hAnsi="Calibri"/>
         </w:rPr>
-        <w:t xml:space="preserve">Known gaps against the target design</w:t>
+        <w:t xml:space="preserve">Remaining notes</w:t>
       </w:r>
     </w:p>
     <w:p>
@@ -25798,7 +25750,7 @@
         <w:rPr>
           <w:rFonts w:ascii="Calibri" w:cs="Calibri" w:eastAsia="Calibri" w:hAnsi="Calibri"/>
         </w:rPr>
-        <w:t xml:space="preserve">utils.js also contains logic for C5, C7, C8, C9 and C11; to be split.</w:t>
+        <w:t xml:space="preserve">None.</w:t>
       </w:r>
     </w:p>
     <w:p>
@@ -27494,7 +27446,7 @@
         <w:rPr>
           <w:rFonts w:ascii="Calibri" w:cs="Calibri" w:eastAsia="Calibri" w:hAnsi="Calibri"/>
         </w:rPr>
-        <w:t xml:space="preserve">Where it lives in the code today</w:t>
+        <w:t xml:space="preserve">Where it lives in the code</w:t>
       </w:r>
     </w:p>
     <w:p>
@@ -27510,7 +27462,7 @@
         <w:rPr>
           <w:rFonts w:ascii="Calibri" w:cs="Calibri" w:eastAsia="Calibri" w:hAnsi="Calibri"/>
         </w:rPr>
-        <w:t xml:space="preserve">components/Sheet.jsx, Modal.jsx, Stepper.jsx, PlateBar.jsx, ChartCard.jsx</w:t>
+        <w:t xml:space="preserve">ui/Sheet.jsx, Modal.jsx, Stepper.jsx, PlateBar.jsx, ChartCard.jsx, UndoToast.jsx</w:t>
       </w:r>
     </w:p>
     <w:p>
@@ -27526,7 +27478,19 @@
         <w:rPr>
           <w:rFonts w:ascii="Calibri" w:cs="Calibri" w:eastAsia="Calibri" w:hAnsi="Calibri"/>
         </w:rPr>
-        <w:t xml:space="preserve">components/plan/UndoToast.jsx</w:t>
+        <w:t xml:space="preserve">ui/useFocusTrap.js, ui/colors.js, ui/styles.css</w:t>
+      </w:r>
+    </w:p>
+    <w:p>
+      <w:pPr>
+        <w:pStyle w:val="Heading3"/>
+        <w:keepNext/>
+      </w:pPr>
+      <w:r>
+        <w:rPr>
+          <w:rFonts w:ascii="Calibri" w:cs="Calibri" w:eastAsia="Calibri" w:hAnsi="Calibri"/>
+        </w:rPr>
+        <w:t xml:space="preserve">Rules and behaviour</w:t>
       </w:r>
     </w:p>
     <w:p>
@@ -27542,19 +27506,7 @@
         <w:rPr>
           <w:rFonts w:ascii="Calibri" w:cs="Calibri" w:eastAsia="Calibri" w:hAnsi="Calibri"/>
         </w:rPr>
-        <w:t xml:space="preserve">lib/useFocusTrap.js, styles.css, COLORS in utils.js</w:t>
-      </w:r>
-    </w:p>
-    <w:p>
-      <w:pPr>
-        <w:pStyle w:val="Heading3"/>
-        <w:keepNext/>
-      </w:pPr>
-      <w:r>
-        <w:rPr>
-          <w:rFonts w:ascii="Calibri" w:cs="Calibri" w:eastAsia="Calibri" w:hAnsi="Calibri"/>
-        </w:rPr>
-        <w:t xml:space="preserve">Rules and behaviour</w:t>
+        <w:t xml:space="preserve">No business logic and no data access.</w:t>
       </w:r>
     </w:p>
     <w:p>
@@ -27570,7 +27522,19 @@
         <w:rPr>
           <w:rFonts w:ascii="Calibri" w:cs="Calibri" w:eastAsia="Calibri" w:hAnsi="Calibri"/>
         </w:rPr>
-        <w:t xml:space="preserve">No business logic and no data access.</w:t>
+        <w:t xml:space="preserve">Tap targets are at least 44 px.</w:t>
+      </w:r>
+    </w:p>
+    <w:p>
+      <w:pPr>
+        <w:pStyle w:val="Heading3"/>
+        <w:keepNext/>
+      </w:pPr>
+      <w:r>
+        <w:rPr>
+          <w:rFonts w:ascii="Calibri" w:cs="Calibri" w:eastAsia="Calibri" w:hAnsi="Calibri"/>
+        </w:rPr>
+        <w:t xml:space="preserve">Remaining notes</w:t>
       </w:r>
     </w:p>
     <w:p>
@@ -27586,51 +27550,7 @@
         <w:rPr>
           <w:rFonts w:ascii="Calibri" w:cs="Calibri" w:eastAsia="Calibri" w:hAnsi="Calibri"/>
         </w:rPr>
-        <w:t xml:space="preserve">Tap targets are at least 44 px.</w:t>
-      </w:r>
-    </w:p>
-    <w:p>
-      <w:pPr>
-        <w:pStyle w:val="Heading3"/>
-        <w:keepNext/>
-      </w:pPr>
-      <w:r>
-        <w:rPr>
-          <w:rFonts w:ascii="Calibri" w:cs="Calibri" w:eastAsia="Calibri" w:hAnsi="Calibri"/>
-        </w:rPr>
-        <w:t xml:space="preserve">Known gaps against the target design</w:t>
-      </w:r>
-    </w:p>
-    <w:p>
-      <w:pPr>
-        <w:pStyle w:val="ListParagraph"/>
-        <w:numPr>
-          <w:ilvl w:val="0"/>
-          <w:numId w:val="2"/>
-        </w:numPr>
-        <w:spacing w:after="60"/>
-      </w:pPr>
-      <w:r>
-        <w:rPr>
-          <w:rFonts w:ascii="Calibri" w:cs="Calibri" w:eastAsia="Calibri" w:hAnsi="Calibri"/>
-        </w:rPr>
-        <w:t xml:space="preserve">Modal does not trap focus yet (only Sheet does); it should reuse useFocusTrap.</w:t>
-      </w:r>
-    </w:p>
-    <w:p>
-      <w:pPr>
-        <w:pStyle w:val="ListParagraph"/>
-        <w:numPr>
-          <w:ilvl w:val="0"/>
-          <w:numId w:val="2"/>
-        </w:numPr>
-        <w:spacing w:after="60"/>
-      </w:pPr>
-      <w:r>
-        <w:rPr>
-          <w:rFonts w:ascii="Calibri" w:cs="Calibri" w:eastAsia="Calibri" w:hAnsi="Calibri"/>
-        </w:rPr>
-        <w:t xml:space="preserve">UndoToast and COLORS are stored outside the UI Kit folders.</w:t>
+        <w:t xml:space="preserve">None. Modal now traps focus like Sheet.</w:t>
       </w:r>
     </w:p>
     <w:p>
@@ -29674,7 +29594,7 @@
         <w:rPr>
           <w:rFonts w:ascii="Calibri" w:cs="Calibri" w:eastAsia="Calibri" w:hAnsi="Calibri"/>
         </w:rPr>
-        <w:t xml:space="preserve">Where it lives in the code today</w:t>
+        <w:t xml:space="preserve">Where it lives in the code</w:t>
       </w:r>
     </w:p>
     <w:p>
@@ -29690,7 +29610,7 @@
         <w:rPr>
           <w:rFonts w:ascii="Calibri" w:cs="Calibri" w:eastAsia="Calibri" w:hAnsi="Calibri"/>
         </w:rPr>
-        <w:t xml:space="preserve">App.jsx, main.jsx, components/Layout.jsx</w:t>
+        <w:t xml:space="preserve">app/App.jsx, app/Layout.jsx, main.jsx</w:t>
       </w:r>
     </w:p>
     <w:p>
@@ -29706,7 +29626,19 @@
         <w:rPr>
           <w:rFonts w:ascii="Calibri" w:cs="Calibri" w:eastAsia="Calibri" w:hAnsi="Calibri"/>
         </w:rPr>
-        <w:t xml:space="preserve">pages/Dashboard.jsx, ExerciseDetail.jsx, Charts.jsx, Settings.jsx</w:t>
+        <w:t xml:space="preserve">app/views/ (Dashboard, Lifts, ExerciseDetail, ExerciseSheet + useExerciseSheet, PlanPage, TodayCard, Charts, Settings)</w:t>
+      </w:r>
+    </w:p>
+    <w:p>
+      <w:pPr>
+        <w:pStyle w:val="Heading3"/>
+        <w:keepNext/>
+      </w:pPr>
+      <w:r>
+        <w:rPr>
+          <w:rFonts w:ascii="Calibri" w:cs="Calibri" w:eastAsia="Calibri" w:hAnsi="Calibri"/>
+        </w:rPr>
+        <w:t xml:space="preserve">Rules and behaviour</w:t>
       </w:r>
     </w:p>
     <w:p>
@@ -29722,19 +29654,7 @@
         <w:rPr>
           <w:rFonts w:ascii="Calibri" w:cs="Calibri" w:eastAsia="Calibri" w:hAnsi="Calibri"/>
         </w:rPr>
-        <w:t xml:space="preserve">components/exercise/ExerciseSheet.jsx, useExerciseSheet.jsx, components/plan/TodayCard.jsx</w:t>
-      </w:r>
-    </w:p>
-    <w:p>
-      <w:pPr>
-        <w:pStyle w:val="Heading3"/>
-        <w:keepNext/>
-      </w:pPr>
-      <w:r>
-        <w:rPr>
-          <w:rFonts w:ascii="Calibri" w:cs="Calibri" w:eastAsia="Calibri" w:hAnsi="Calibri"/>
-        </w:rPr>
-        <w:t xml:space="preserve">Rules and behaviour</w:t>
+        <w:t xml:space="preserve">No view duplicates a rule that belongs to a component.</w:t>
       </w:r>
     </w:p>
     <w:p>
@@ -29750,7 +29670,19 @@
         <w:rPr>
           <w:rFonts w:ascii="Calibri" w:cs="Calibri" w:eastAsia="Calibri" w:hAnsi="Calibri"/>
         </w:rPr>
-        <w:t xml:space="preserve">No view duplicates a rule that belongs to a component.</w:t>
+        <w:t xml:space="preserve">Cross-component actions (for example deleting an exercise together with its logs) are orchestrated here.</w:t>
+      </w:r>
+    </w:p>
+    <w:p>
+      <w:pPr>
+        <w:pStyle w:val="Heading3"/>
+        <w:keepNext/>
+      </w:pPr>
+      <w:r>
+        <w:rPr>
+          <w:rFonts w:ascii="Calibri" w:cs="Calibri" w:eastAsia="Calibri" w:hAnsi="Calibri"/>
+        </w:rPr>
+        <w:t xml:space="preserve">Remaining notes</w:t>
       </w:r>
     </w:p>
     <w:p>
@@ -29766,35 +29698,7 @@
         <w:rPr>
           <w:rFonts w:ascii="Calibri" w:cs="Calibri" w:eastAsia="Calibri" w:hAnsi="Calibri"/>
         </w:rPr>
-        <w:t xml:space="preserve">Cross-component actions (for example deleting an exercise together with its logs) are orchestrated here.</w:t>
-      </w:r>
-    </w:p>
-    <w:p>
-      <w:pPr>
-        <w:pStyle w:val="Heading3"/>
-        <w:keepNext/>
-      </w:pPr>
-      <w:r>
-        <w:rPr>
-          <w:rFonts w:ascii="Calibri" w:cs="Calibri" w:eastAsia="Calibri" w:hAnsi="Calibri"/>
-        </w:rPr>
-        <w:t xml:space="preserve">Known gaps against the target design</w:t>
-      </w:r>
-    </w:p>
-    <w:p>
-      <w:pPr>
-        <w:pStyle w:val="ListParagraph"/>
-        <w:numPr>
-          <w:ilvl w:val="0"/>
-          <w:numId w:val="2"/>
-        </w:numPr>
-        <w:spacing w:after="60"/>
-      </w:pPr>
-      <w:r>
-        <w:rPr>
-          <w:rFonts w:ascii="Calibri" w:cs="Calibri" w:eastAsia="Calibri" w:hAnsi="Calibri"/>
-        </w:rPr>
-        <w:t xml:space="preserve">Dashboard.jsx still computes goal, streak and the week row itself (C7 logic).</w:t>
+        <w:t xml:space="preserve">Dashboard still formats the PR list and the InBody summary itself (presentation only).</w:t>
       </w:r>
     </w:p>
     <w:p>
@@ -31178,7 +31082,7 @@
         <w:rPr>
           <w:rFonts w:ascii="Calibri" w:cs="Calibri" w:eastAsia="Calibri" w:hAnsi="Calibri"/>
         </w:rPr>
-        <w:t xml:space="preserve">Where it lives in the code today</w:t>
+        <w:t xml:space="preserve">Where it lives in the code</w:t>
       </w:r>
     </w:p>
     <w:p>
@@ -31234,7 +31138,7 @@
         <w:rPr>
           <w:rFonts w:ascii="Calibri" w:cs="Calibri" w:eastAsia="Calibri" w:hAnsi="Calibri"/>
         </w:rPr>
-        <w:t xml:space="preserve">Known gaps against the target design</w:t>
+        <w:t xml:space="preserve">Remaining notes</w:t>
       </w:r>
     </w:p>
     <w:p>

</xml_diff>

<commit_message>
Packages: identity, datastore, shared and ui are npm workspace packages
Co-Authored-By: Claude Sonnet 5.5 <noreply@anthropic.com>
Claude-Session: https://claude.ai/code/session_01Cf2G3TpPkUnBMvTak1UT1v
</commit_message>
<xml_diff>
--- a/docs/Forge_Component_Spec.docx
+++ b/docs/Forge_Component_Spec.docx
@@ -6577,7 +6577,7 @@
         <w:rPr>
           <w:rFonts w:ascii="Calibri" w:cs="Calibri" w:eastAsia="Calibri" w:hAnsi="Calibri"/>
         </w:rPr>
-        <w:t xml:space="preserve">identity/AuthProvider.jsx (session, signOut)</w:t>
+        <w:t xml:space="preserve">packages/identity/src/AuthProvider.jsx (session, signOut)</w:t>
       </w:r>
     </w:p>
     <w:p>
@@ -6593,7 +6593,7 @@
         <w:rPr>
           <w:rFonts w:ascii="Calibri" w:cs="Calibri" w:eastAsia="Calibri" w:hAnsi="Calibri"/>
         </w:rPr>
-        <w:t xml:space="preserve">identity/ProfileProvider.jsx (profile, saveProfile, default profile)</w:t>
+        <w:t xml:space="preserve">packages/identity/src/ProfileProvider.jsx (profile, saveProfile, default profile)</w:t>
       </w:r>
     </w:p>
     <w:p>
@@ -6609,7 +6609,7 @@
         <w:rPr>
           <w:rFonts w:ascii="Calibri" w:cs="Calibri" w:eastAsia="Calibri" w:hAnsi="Calibri"/>
         </w:rPr>
-        <w:t xml:space="preserve">identity/Login.jsx (sign in/up UI and error mapping)</w:t>
+        <w:t xml:space="preserve">packages/identity/src/Login.jsx (sign in/up UI and error mapping)</w:t>
       </w:r>
     </w:p>
     <w:p>
@@ -6625,7 +6625,7 @@
         <w:rPr>
           <w:rFonts w:ascii="Calibri" w:cs="Calibri" w:eastAsia="Calibri" w:hAnsi="Calibri"/>
         </w:rPr>
-        <w:t xml:space="preserve">firebase.js (SDK initialisation)</w:t>
+        <w:t xml:space="preserve">packages/datastore/src/firebase.js (Firebase app initialisation, owned by the data store)</w:t>
       </w:r>
     </w:p>
     <w:p>
@@ -6713,7 +6713,7 @@
         <w:rPr>
           <w:rFonts w:ascii="Calibri" w:cs="Calibri" w:eastAsia="Calibri" w:hAnsi="Calibri"/>
         </w:rPr>
-        <w:t xml:space="preserve">None. Session and profile are separate providers; the shell mounts them in order (session, data store, profile, units).</w:t>
+        <w:t xml:space="preserve">None. This component is the npm package @forge/identity. Session and profile are separate providers; the shell mounts them in order (session, data store, profile, units).</w:t>
       </w:r>
     </w:p>
     <w:p>
@@ -8474,7 +8474,7 @@
         <w:rPr>
           <w:rFonts w:ascii="Calibri" w:cs="Calibri" w:eastAsia="Calibri" w:hAnsi="Calibri"/>
         </w:rPr>
-        <w:t xml:space="preserve">datastore/DataStore.jsx (makeDataStore, DataStoreProvider, useDataStore, useCol)</w:t>
+        <w:t xml:space="preserve">packages/datastore/src/DataStore.jsx (makeDataStore, DataStoreProvider, useDataStore, useCol)</w:t>
       </w:r>
     </w:p>
     <w:p>
@@ -8562,7 +8562,7 @@
         <w:rPr>
           <w:rFonts w:ascii="Calibri" w:cs="Calibri" w:eastAsia="Calibri" w:hAnsi="Calibri"/>
         </w:rPr>
-        <w:t xml:space="preserve">None. The uid is injected by the shell, so there is no dependency on Identity.</w:t>
+        <w:t xml:space="preserve">None. This component is the npm package @forge/datastore. The uid is injected by the shell, so there is no dependency on Identity.</w:t>
       </w:r>
     </w:p>
     <w:p>
@@ -25678,7 +25678,7 @@
         <w:rPr>
           <w:rFonts w:ascii="Calibri" w:cs="Calibri" w:eastAsia="Calibri" w:hAnsi="Calibri"/>
         </w:rPr>
-        <w:t xml:space="preserve">shared/units.js (makeUnits, KG_PER_LB, r1), shared/UnitsProvider.jsx (useUnits)</w:t>
+        <w:t xml:space="preserve">packages/shared/src/units.js (makeUnits, KG_PER_LB, r1), UnitsProvider.jsx (useUnits)</w:t>
       </w:r>
     </w:p>
     <w:p>
@@ -25694,7 +25694,7 @@
         <w:rPr>
           <w:rFonts w:ascii="Calibri" w:cs="Calibri" w:eastAsia="Calibri" w:hAnsi="Calibri"/>
         </w:rPr>
-        <w:t xml:space="preserve">shared/dates.js</w:t>
+        <w:t xml:space="preserve">packages/shared/src/dates.js</w:t>
       </w:r>
     </w:p>
     <w:p>
@@ -27462,7 +27462,7 @@
         <w:rPr>
           <w:rFonts w:ascii="Calibri" w:cs="Calibri" w:eastAsia="Calibri" w:hAnsi="Calibri"/>
         </w:rPr>
-        <w:t xml:space="preserve">ui/Sheet.jsx, Modal.jsx, Stepper.jsx, PlateBar.jsx, ChartCard.jsx, UndoToast.jsx</w:t>
+        <w:t xml:space="preserve">packages/ui/src/Sheet.jsx, Modal.jsx, Stepper.jsx, PlateBar.jsx, ChartCard.jsx, UndoToast.jsx</w:t>
       </w:r>
     </w:p>
     <w:p>
@@ -27478,7 +27478,7 @@
         <w:rPr>
           <w:rFonts w:ascii="Calibri" w:cs="Calibri" w:eastAsia="Calibri" w:hAnsi="Calibri"/>
         </w:rPr>
-        <w:t xml:space="preserve">ui/useFocusTrap.js, ui/colors.js, ui/styles.css</w:t>
+        <w:t xml:space="preserve">packages/ui/src/useFocusTrap.js, colors.js, styles.css</w:t>
       </w:r>
     </w:p>
     <w:p>

</xml_diff>

<commit_message>
Error boundaries: a crash in one page no longer blanks the app; docs, diagrams and PDFs updated
Co-Authored-By: Claude Sonnet 5.5 <noreply@anthropic.com>
Claude-Session: https://claude.ai/code/session_01Cf2G3TpPkUnBMvTak1UT1v
</commit_message>
<xml_diff>
--- a/docs/Forge_Component_Spec.docx
+++ b/docs/Forge_Component_Spec.docx
@@ -26064,7 +26064,7 @@
                 <w:sz w:val="18"/>
                 <w:szCs w:val="18"/>
               </w:rPr>
-              <w:t xml:space="preserve">FR-UI-01 to FR-UI-04</w:t>
+              <w:t xml:space="preserve">FR-UI-01 to FR-UI-06</w:t>
             </w:r>
           </w:p>
         </w:tc>
@@ -26116,7 +26116,7 @@
         <w:rPr>
           <w:rFonts w:ascii="Calibri" w:cs="Calibri" w:eastAsia="Calibri" w:hAnsi="Calibri"/>
         </w:rPr>
-        <w:t xml:space="preserve">Modal dialog, numeric stepper (44 px buttons, typed input clamped on blur), undo toast (8 seconds), barbell progress bar, chart card (bar/line, zoom).</w:t>
+        <w:t xml:space="preserve">Modal dialog, numeric stepper (44 px buttons, typed input clamped on blur), undo toast (8 seconds), barbell progress bar, chart card (bar/line, zoom), error boundary.</w:t>
       </w:r>
     </w:p>
     <w:p>
@@ -26746,7 +26746,7 @@
                 <w:sz w:val="18"/>
                 <w:szCs w:val="18"/>
               </w:rPr>
-              <w:t xml:space="preserve">PlateBar({pct, start, current, target, unit})</w:t>
+              <w:t xml:space="preserve">ErrorBoundary({fallback, resetKey, onError, title})</w:t>
             </w:r>
           </w:p>
         </w:tc>
@@ -26778,7 +26778,7 @@
                 <w:sz w:val="18"/>
                 <w:szCs w:val="18"/>
               </w:rPr>
-              <w:t xml:space="preserve">Barbell-style progress bar.</w:t>
+              <w:t xml:space="preserve">Shows a message with Try again instead of the part that crashed; fallback(error, reset) can replace it; changing resetKey retries.</w:t>
             </w:r>
           </w:p>
         </w:tc>
@@ -26849,7 +26849,7 @@
                 <w:sz w:val="18"/>
                 <w:szCs w:val="18"/>
               </w:rPr>
-              <w:t xml:space="preserve">ChartCard({title, subtitle, data, series, defaultType, defaultZoom, extra})</w:t>
+              <w:t xml:space="preserve">PlateBar({pct, start, current, target, unit})</w:t>
             </w:r>
           </w:p>
         </w:tc>
@@ -26882,7 +26882,7 @@
                 <w:sz w:val="18"/>
                 <w:szCs w:val="18"/>
               </w:rPr>
-              <w:t xml:space="preserve">Chart with toggles.</w:t>
+              <w:t xml:space="preserve">Barbell-style progress bar.</w:t>
             </w:r>
           </w:p>
         </w:tc>
@@ -26951,7 +26951,7 @@
                 <w:sz w:val="18"/>
                 <w:szCs w:val="18"/>
               </w:rPr>
-              <w:t xml:space="preserve">useFocusTrap(ref, onEscape)</w:t>
+              <w:t xml:space="preserve">ChartCard({title, subtitle, data, series, defaultType, defaultZoom, extra})</w:t>
             </w:r>
           </w:p>
         </w:tc>
@@ -26983,7 +26983,7 @@
                 <w:sz w:val="18"/>
                 <w:szCs w:val="18"/>
               </w:rPr>
-              <w:t xml:space="preserve">Focus cycling, Escape, scroll lock, focus return.</w:t>
+              <w:t xml:space="preserve">Chart with toggles.</w:t>
             </w:r>
           </w:p>
         </w:tc>
@@ -27021,6 +27021,109 @@
                 <w:sz w:val="18"/>
                 <w:szCs w:val="18"/>
               </w:rPr>
+              <w:t xml:space="preserve">UI components</w:t>
+            </w:r>
+          </w:p>
+        </w:tc>
+        <w:tc>
+          <w:tcPr>
+            <w:tcW w:type="dxa" w:w="3200"/>
+            <w:tcBorders>
+              <w:top w:val="single" w:color="BFC5CF" w:sz="4"/>
+              <w:left w:val="single" w:color="BFC5CF" w:sz="4"/>
+              <w:bottom w:val="single" w:color="BFC5CF" w:sz="4"/>
+              <w:right w:val="single" w:color="BFC5CF" w:sz="4"/>
+            </w:tcBorders>
+            <w:shd w:fill="F4F6F9" w:color="auto" w:val="clear"/>
+            <w:tcMar>
+              <w:top w:type="dxa" w:w="60"/>
+              <w:left w:type="dxa" w:w="90"/>
+              <w:bottom w:type="dxa" w:w="60"/>
+              <w:right w:type="dxa" w:w="90"/>
+            </w:tcMar>
+          </w:tcPr>
+          <w:p>
+            <w:pPr>
+              <w:spacing w:after="0"/>
+            </w:pPr>
+            <w:r>
+              <w:rPr>
+                <w:rFonts w:ascii="Calibri" w:cs="Calibri" w:eastAsia="Calibri" w:hAnsi="Calibri"/>
+                <w:b w:val="false"/>
+                <w:bCs w:val="false"/>
+                <w:sz w:val="18"/>
+                <w:szCs w:val="18"/>
+              </w:rPr>
+              <w:t xml:space="preserve">useFocusTrap(ref, onEscape)</w:t>
+            </w:r>
+          </w:p>
+        </w:tc>
+        <w:tc>
+          <w:tcPr>
+            <w:tcW w:type="dxa" w:w="4938"/>
+            <w:tcBorders>
+              <w:top w:val="single" w:color="BFC5CF" w:sz="4"/>
+              <w:left w:val="single" w:color="BFC5CF" w:sz="4"/>
+              <w:bottom w:val="single" w:color="BFC5CF" w:sz="4"/>
+              <w:right w:val="single" w:color="BFC5CF" w:sz="4"/>
+            </w:tcBorders>
+            <w:shd w:fill="F4F6F9" w:color="auto" w:val="clear"/>
+            <w:tcMar>
+              <w:top w:type="dxa" w:w="60"/>
+              <w:left w:type="dxa" w:w="90"/>
+              <w:bottom w:type="dxa" w:w="60"/>
+              <w:right w:type="dxa" w:w="90"/>
+            </w:tcMar>
+          </w:tcPr>
+          <w:p>
+            <w:pPr>
+              <w:spacing w:after="0"/>
+            </w:pPr>
+            <w:r>
+              <w:rPr>
+                <w:rFonts w:ascii="Calibri" w:cs="Calibri" w:eastAsia="Calibri" w:hAnsi="Calibri"/>
+                <w:b w:val="false"/>
+                <w:bCs w:val="false"/>
+                <w:sz w:val="18"/>
+                <w:szCs w:val="18"/>
+              </w:rPr>
+              <w:t xml:space="preserve">Focus cycling, Escape, scroll lock, focus return.</w:t>
+            </w:r>
+          </w:p>
+        </w:tc>
+      </w:tr>
+      <w:tr>
+        <w:trPr>
+          <w:cantSplit/>
+        </w:trPr>
+        <w:tc>
+          <w:tcPr>
+            <w:tcW w:type="dxa" w:w="1500"/>
+            <w:tcBorders>
+              <w:top w:val="single" w:color="BFC5CF" w:sz="4"/>
+              <w:left w:val="single" w:color="BFC5CF" w:sz="4"/>
+              <w:bottom w:val="single" w:color="BFC5CF" w:sz="4"/>
+              <w:right w:val="single" w:color="BFC5CF" w:sz="4"/>
+            </w:tcBorders>
+            <w:tcMar>
+              <w:top w:type="dxa" w:w="60"/>
+              <w:left w:type="dxa" w:w="90"/>
+              <w:bottom w:type="dxa" w:w="60"/>
+              <w:right w:type="dxa" w:w="90"/>
+            </w:tcMar>
+          </w:tcPr>
+          <w:p>
+            <w:pPr>
+              <w:spacing w:after="0"/>
+            </w:pPr>
+            <w:r>
+              <w:rPr>
+                <w:rFonts w:ascii="Calibri" w:cs="Calibri" w:eastAsia="Calibri" w:hAnsi="Calibri"/>
+                <w:b/>
+                <w:bCs/>
+                <w:sz w:val="18"/>
+                <w:szCs w:val="18"/>
+              </w:rPr>
               <w:t xml:space="preserve">Theme</w:t>
             </w:r>
           </w:p>
@@ -27034,7 +27137,6 @@
               <w:bottom w:val="single" w:color="BFC5CF" w:sz="4"/>
               <w:right w:val="single" w:color="BFC5CF" w:sz="4"/>
             </w:tcBorders>
-            <w:shd w:fill="F4F6F9" w:color="auto" w:val="clear"/>
             <w:tcMar>
               <w:top w:type="dxa" w:w="60"/>
               <w:left w:type="dxa" w:w="90"/>
@@ -27067,7 +27169,6 @@
               <w:bottom w:val="single" w:color="BFC5CF" w:sz="4"/>
               <w:right w:val="single" w:color="BFC5CF" w:sz="4"/>
             </w:tcBorders>
-            <w:shd w:fill="F4F6F9" w:color="auto" w:val="clear"/>
             <w:tcMar>
               <w:top w:type="dxa" w:w="60"/>
               <w:left w:type="dxa" w:w="90"/>
@@ -27462,7 +27563,7 @@
         <w:rPr>
           <w:rFonts w:ascii="Calibri" w:cs="Calibri" w:eastAsia="Calibri" w:hAnsi="Calibri"/>
         </w:rPr>
-        <w:t xml:space="preserve">packages/ui/src/Sheet.jsx, Modal.jsx, Stepper.jsx, PlateBar.jsx, ChartCard.jsx, UndoToast.jsx</w:t>
+        <w:t xml:space="preserve">packages/ui/src/Sheet.jsx, Modal.jsx, Stepper.jsx, PlateBar.jsx, ChartCard.jsx, UndoToast.jsx, ErrorBoundary.jsx</w:t>
       </w:r>
     </w:p>
     <w:p>
@@ -27864,7 +27965,7 @@
                 <w:sz w:val="18"/>
                 <w:szCs w:val="18"/>
               </w:rPr>
-              <w:t xml:space="preserve">FR-APP-01 to FR-APP-04</w:t>
+              <w:t xml:space="preserve">FR-APP-01 to FR-APP-05</w:t>
             </w:r>
           </w:p>
         </w:tc>
@@ -27949,6 +28050,22 @@
           <w:rFonts w:ascii="Calibri" w:cs="Calibri" w:eastAsia="Calibri" w:hAnsi="Calibri"/>
         </w:rPr>
         <w:t xml:space="preserve">Provide the user id to the Data Store and connect interfaces between components.</w:t>
+      </w:r>
+    </w:p>
+    <w:p>
+      <w:pPr>
+        <w:pStyle w:val="ListParagraph"/>
+        <w:numPr>
+          <w:ilvl w:val="0"/>
+          <w:numId w:val="2"/>
+        </w:numPr>
+        <w:spacing w:after="60"/>
+      </w:pPr>
+      <w:r>
+        <w:rPr>
+          <w:rFonts w:ascii="Calibri" w:cs="Calibri" w:eastAsia="Calibri" w:hAnsi="Calibri"/>
+        </w:rPr>
+        <w:t xml:space="preserve">Contain failures: every page sits in an error boundary (message, Try again, Go to Home) and the whole app has a last-resort Reload screen.</w:t>
       </w:r>
     </w:p>
     <w:p>
@@ -29610,7 +29727,7 @@
         <w:rPr>
           <w:rFonts w:ascii="Calibri" w:cs="Calibri" w:eastAsia="Calibri" w:hAnsi="Calibri"/>
         </w:rPr>
-        <w:t xml:space="preserve">app/App.jsx, app/Layout.jsx, main.jsx</w:t>
+        <w:t xml:space="preserve">app/App.jsx, app/Layout.jsx, app/PageError.jsx (page error and Reload screens), main.jsx</w:t>
       </w:r>
     </w:p>
     <w:p>

</xml_diff>